<commit_message>
Fix a real citation-tagging bug on Boulderfield, found by a live audit
Appendix A's Boulderfield elevation (~12,760 ft) was tagged [S4]
(Naismith's Rule -- unrelated) instead of [MA-BF]; it's derived
arithmetic (9,400 + MA-BF's 3,360 ft gain), same as the two rows
around it. The same mistag was baked into the published .docx and
.xlsx, and the HTML's footer Sources list had folded S5 into S9's line
under the wrong bullet number. No number, margin, or verdict changed
-- citation labeling only.

Live audit (real browser, real DOM events) confirmed: no JS syntax
errors, every Working Notebook step matches sensitivity_model.py
exactly including the Twist toggle, and no slider/range-bound issue
(this case uses typed number inputs, not sliders, so Pier Wheel's
specific bug class doesn't apply here).

Co-Authored-By: Claude Sonnet 5 <noreply@anthropic.com>
</commit_message>
<xml_diff>
--- a/cases/boulderfield/published/Boulderfield - Case Study.docx
+++ b/cases/boulderfield/published/Boulderfield - Case Study.docx
@@ -476,7 +476,7 @@
           </w:tcPr>
           <w:p>
             <w:r>
-              <w:t xml:space="preserve">~12,760 ft [S4]</w:t>
+              <w:t xml:space="preserve">~12,760 ft [MA-BF]</w:t>
             </w:r>
           </w:p>
         </w:tc>
@@ -1648,7 +1648,7 @@
             <w:r>
               <w:t xml:space="preserve">14ers.com — </w:t>
             </w:r>
-            <w:hyperlink w:history="1" r:id="rId2xj73jxj7h3de1vw7tvbe">
+            <w:hyperlink w:history="1" r:id="rIdie4qz0d9gwmv9szw-eh3m">
               <w:r>
                 <w:rPr>
                   <w:rStyle w:val="Hyperlink"/>
@@ -1718,7 +1718,7 @@
             <w:r>
               <w:t xml:space="preserve">14ers.com — </w:t>
             </w:r>
-            <w:hyperlink w:history="1" r:id="rIdj6pyueg0sin2zcxlbdhpx">
+            <w:hyperlink w:history="1" r:id="rId3qvhubovlz59nbuwhnsad">
               <w:r>
                 <w:rPr>
                   <w:rStyle w:val="Hyperlink"/>
@@ -1788,7 +1788,7 @@
             <w:r>
               <w:t xml:space="preserve">National Park Service, Rocky Mountain National Park — </w:t>
             </w:r>
-            <w:hyperlink w:history="1" r:id="rIdsug8hvucudxhp8jeledum">
+            <w:hyperlink w:history="1" r:id="rIdgcbjd9xuxxzufow5h4oxu">
               <w:r>
                 <w:rPr>
                   <w:rStyle w:val="Hyperlink"/>
@@ -1858,7 +1858,7 @@
             <w:r>
               <w:t xml:space="preserve">Wikipedia, citing William W. Naismith's original 1892 Scottish Mountaineering Club Journal report — </w:t>
             </w:r>
-            <w:hyperlink w:history="1" r:id="rIdaswj0gfwo1oeiag7nmovk">
+            <w:hyperlink w:history="1" r:id="rIdcigdt84etduzubpmtkcjq">
               <w:r>
                 <w:rPr>
                   <w:rStyle w:val="Hyperlink"/>
@@ -1928,7 +1928,7 @@
             <w:r>
               <w:t xml:space="preserve">National Park Service, Rocky Mountain National Park — </w:t>
             </w:r>
-            <w:hyperlink w:history="1" r:id="rIdp0jhzlagnpuedtcqc3nrq">
+            <w:hyperlink w:history="1" r:id="rIdpm2pccxresof5l1sxjqsu">
               <w:r>
                 <w:rPr>
                   <w:rStyle w:val="Hyperlink"/>
@@ -1998,7 +1998,7 @@
             <w:r>
               <w:t xml:space="preserve">NOAA Storm Prediction Center glossary of sounding terms (adiabatic lapse rate context) and standard-atmosphere meteorology references — </w:t>
             </w:r>
-            <w:hyperlink w:history="1" r:id="rIdqd-oq5cpidezfuff_0dwd">
+            <w:hyperlink w:history="1" r:id="rIdmioaqqob1ycqhgwckh5ic">
               <w:r>
                 <w:rPr>
                   <w:rStyle w:val="Hyperlink"/>
@@ -2068,7 +2068,7 @@
             <w:r>
               <w:t xml:space="preserve">National Weather Service — </w:t>
             </w:r>
-            <w:hyperlink w:history="1" r:id="rIdarjdx_j6q2bpgj-jbq4ax">
+            <w:hyperlink w:history="1" r:id="rId4gzl8b71gbyi7kg9bfmj2">
               <w:r>
                 <w:rPr>
                   <w:rStyle w:val="Hyperlink"/>
@@ -2138,7 +2138,7 @@
             <w:r>
               <w:t xml:space="preserve">SummitPost — </w:t>
             </w:r>
-            <w:hyperlink w:history="1" r:id="rId1s9votuj1ot_ndgb51ucf">
+            <w:hyperlink w:history="1" r:id="rIdvmkzo0vz9r-c7fwjkxfey">
               <w:r>
                 <w:rPr>
                   <w:rStyle w:val="Hyperlink"/>
@@ -2208,7 +2208,7 @@
             <w:r>
               <w:t xml:space="preserve">National Park Service, Rocky Mountain National Park — </w:t>
             </w:r>
-            <w:hyperlink w:history="1" r:id="rId1koh0pjxck4mj7jhvoeee">
+            <w:hyperlink w:history="1" r:id="rIdwmvqqj4s8ccirxlcjygwu">
               <w:r>
                 <w:rPr>
                   <w:rStyle w:val="Hyperlink"/>

</xml_diff>